<commit_message>
Contributions par membre (Pierre Postal, Fabien Tavernier, Fabien Lubin)
Co-Authored-By: Claude Opus 4.8 <noreply@anthropic.com>
</commit_message>
<xml_diff>
--- a/rapport.docx
+++ b/rapport.docx
@@ -2327,8 +2327,13 @@
         <w:t xml:space="preserve">bonus explicitement exclus</w:t>
       </w:r>
       <w:r>
-        <w:t xml:space="preserve"> de l'évaluation : post, reformuler (ne dégradent pas le cœur). </w:t>
-      </w:r>
+        <w:t xml:space="preserve"> de l'évaluation : post, reformuler (ne dégradent pas le cœur).</w:t>
+      </w:r>
+    </w:p>
+    <w:p>
+      <w:pPr>
+        <w:spacing w:after="100"/>
+      </w:pPr>
       <w:r>
         <w:rPr>
           <w:b/>
@@ -2337,15 +2342,143 @@
         <w:t xml:space="preserve">Contributions par membre</w:t>
       </w:r>
       <w:r>
-        <w:t xml:space="preserve"> : ⬜ à compléter (voir </w:t>
-      </w:r>
-      <w:r>
-        <w:rPr>
-          <w:rFonts w:ascii="Consolas" w:cs="Consolas" w:eastAsia="Consolas" w:hAnsi="Consolas"/>
-          <w:sz w:val="18"/>
-          <w:szCs w:val="18"/>
-        </w:rPr>
-        <w:t xml:space="preserve">docs/restitution_orale.md</w:t>
+        <w:t xml:space="preserve"> :</w:t>
+      </w:r>
+    </w:p>
+    <w:p>
+      <w:pPr>
+        <w:pStyle w:val="ListParagraph"/>
+        <w:numPr>
+          <w:ilvl w:val="0"/>
+          <w:numId w:val="1"/>
+        </w:numPr>
+        <w:spacing w:after="40"/>
+      </w:pPr>
+      <w:r>
+        <w:rPr>
+          <w:b/>
+          <w:bCs/>
+        </w:rPr>
+        <w:t xml:space="preserve">Pierre Postal</w:t>
+      </w:r>
+      <w:r>
+        <w:t xml:space="preserve"> : couche LLM (</w:t>
+      </w:r>
+      <w:r>
+        <w:rPr>
+          <w:rFonts w:ascii="Consolas" w:cs="Consolas" w:eastAsia="Consolas" w:hAnsi="Consolas"/>
+          <w:sz w:val="18"/>
+          <w:szCs w:val="18"/>
+        </w:rPr>
+        <w:t xml:space="preserve">llm.py</w:t>
+      </w:r>
+      <w:r>
+        <w:t xml:space="preserve">, isolation fournisseur, gestion</w:t>
+      </w:r>
+    </w:p>
+    <w:p>
+      <w:pPr>
+        <w:spacing w:after="100"/>
+      </w:pPr>
+      <w:r>
+        <w:t xml:space="preserve">d'erreurs) + bibliothèque de prompts (</w:t>
+      </w:r>
+      <w:r>
+        <w:rPr>
+          <w:rFonts w:ascii="Consolas" w:cs="Consolas" w:eastAsia="Consolas" w:hAnsi="Consolas"/>
+          <w:sz w:val="18"/>
+          <w:szCs w:val="18"/>
+        </w:rPr>
+        <w:t xml:space="preserve">prompts/</w:t>
+      </w:r>
+      <w:r>
+        <w:t xml:space="preserve">) + journal des 5 itérations.</w:t>
+      </w:r>
+    </w:p>
+    <w:p>
+      <w:pPr>
+        <w:pStyle w:val="ListParagraph"/>
+        <w:numPr>
+          <w:ilvl w:val="0"/>
+          <w:numId w:val="1"/>
+        </w:numPr>
+        <w:spacing w:after="40"/>
+      </w:pPr>
+      <w:r>
+        <w:rPr>
+          <w:b/>
+          <w:bCs/>
+        </w:rPr>
+        <w:t xml:space="preserve">Fabien Tavernier</w:t>
+      </w:r>
+      <w:r>
+        <w:t xml:space="preserve"> : harnais d'évaluation (</w:t>
+      </w:r>
+      <w:r>
+        <w:rPr>
+          <w:rFonts w:ascii="Consolas" w:cs="Consolas" w:eastAsia="Consolas" w:hAnsi="Consolas"/>
+          <w:sz w:val="18"/>
+          <w:szCs w:val="18"/>
+        </w:rPr>
+        <w:t xml:space="preserve">evaluation/</w:t>
+      </w:r>
+      <w:r>
+        <w:t xml:space="preserve">, rubrique, campagne,</w:t>
+      </w:r>
+    </w:p>
+    <w:p>
+      <w:pPr>
+        <w:spacing w:after="100"/>
+      </w:pPr>
+      <w:r>
+        <w:t xml:space="preserve">variance, artefacts) + juge LLM séparé + tests unitaires.</w:t>
+      </w:r>
+    </w:p>
+    <w:p>
+      <w:pPr>
+        <w:pStyle w:val="ListParagraph"/>
+        <w:numPr>
+          <w:ilvl w:val="0"/>
+          <w:numId w:val="1"/>
+        </w:numPr>
+        <w:spacing w:after="40"/>
+      </w:pPr>
+      <w:r>
+        <w:rPr>
+          <w:b/>
+          <w:bCs/>
+        </w:rPr>
+        <w:t xml:space="preserve">Fabien Lubin</w:t>
+      </w:r>
+      <w:r>
+        <w:t xml:space="preserve"> : interface Streamlit (</w:t>
+      </w:r>
+      <w:r>
+        <w:rPr>
+          <w:rFonts w:ascii="Consolas" w:cs="Consolas" w:eastAsia="Consolas" w:hAnsi="Consolas"/>
+          <w:sz w:val="18"/>
+          <w:szCs w:val="18"/>
+        </w:rPr>
+        <w:t xml:space="preserve">app.py</w:t>
+      </w:r>
+      <w:r>
+        <w:t xml:space="preserve">) + mode démo hors-ligne +</w:t>
+      </w:r>
+    </w:p>
+    <w:p>
+      <w:pPr>
+        <w:spacing w:after="100"/>
+      </w:pPr>
+      <w:r>
+        <w:t xml:space="preserve">rédaction du rapport et des documents (</w:t>
+      </w:r>
+      <w:r>
+        <w:rPr>
+          <w:rFonts w:ascii="Consolas" w:cs="Consolas" w:eastAsia="Consolas" w:hAnsi="Consolas"/>
+          <w:sz w:val="18"/>
+          <w:szCs w:val="18"/>
+        </w:rPr>
+        <w:t xml:space="preserve">docs/</w:t>
       </w:r>
       <w:r>
         <w:t xml:space="preserve">).</w:t>

</xml_diff>